<commit_message>
docs: manual renumerado correctamente 1-41 en orden correlativo
Todos los módulos renumerados secuencialmente dentro de cada sección:
  Facturación y Ventas:              1-7   (Proformas → 7)
  Inventario y Cartera por Cobrar:   8-17  (Importar → 12, Gestión Cartera → 17)
  Consultas, Compras y CxP:          18-24 (Ventas por Cliente → 20)
  Tesorería:                         25-30 (Cierre Caja General → 30)
  Contabilidad y Configuración:      31-40 (Permisos Usuario → 40)
  Gerencia:                          41    (Resumen Operacional)

Co-Authored-By: Claude Sonnet 4.6 <noreply@anthropic.com>
</commit_message>
<xml_diff>
--- a/Documentacion_ERP/Manual_Usuario_QuickInvoice.docx
+++ b/Documentacion_ERP/Manual_Usuario_QuickInvoice.docx
@@ -2044,7 +2044,7 @@
         <w:pStyle w:val="Heading2"/>
       </w:pPr>
       <w:r>
-        <w:t>35. Proformas (Cotizaciones)</w:t>
+        <w:t>7. Proformas (Cotizaciones)</w:t>
       </w:r>
     </w:p>
     <w:p>
@@ -2249,7 +2249,7 @@
         <w:pStyle w:val="Heading2"/>
       </w:pPr>
       <w:r>
-        <w:t>7. Ingreso de Inventario</w:t>
+        <w:t>8. Ingreso de Inventario</w:t>
       </w:r>
     </w:p>
     <w:p>
@@ -2309,7 +2309,7 @@
           <w:color w:val="595959"/>
           <w:sz w:val="18"/>
         </w:rPr>
-        <w:t>Figura 7. Ingreso de Inventario</w:t>
+        <w:t>Figura 8. Ingreso de Inventario</w:t>
       </w:r>
     </w:p>
     <w:p>
@@ -2506,7 +2506,7 @@
         <w:pStyle w:val="Heading2"/>
       </w:pPr>
       <w:r>
-        <w:t>8. Inventario Valorado</w:t>
+        <w:t>9. Inventario Valorado</w:t>
       </w:r>
     </w:p>
     <w:p>
@@ -2566,7 +2566,7 @@
           <w:color w:val="595959"/>
           <w:sz w:val="18"/>
         </w:rPr>
-        <w:t>Figura 8. Inventario Valorado</w:t>
+        <w:t>Figura 9. Inventario Valorado</w:t>
       </w:r>
     </w:p>
     <w:p>
@@ -2739,7 +2739,7 @@
         <w:pStyle w:val="Heading2"/>
       </w:pPr>
       <w:r>
-        <w:t>9. Kardex de Inventario</w:t>
+        <w:t>10. Kardex de Inventario</w:t>
       </w:r>
     </w:p>
     <w:p>
@@ -2799,7 +2799,7 @@
           <w:color w:val="595959"/>
           <w:sz w:val="18"/>
         </w:rPr>
-        <w:t>Figura 9. Kardex de Inventario</w:t>
+        <w:t>Figura 10. Kardex de Inventario</w:t>
       </w:r>
     </w:p>
     <w:p>
@@ -2980,7 +2980,7 @@
         <w:pStyle w:val="Heading2"/>
       </w:pPr>
       <w:r>
-        <w:t>10. Vendedores</w:t>
+        <w:t>11. Vendedores</w:t>
       </w:r>
     </w:p>
     <w:p>
@@ -3040,7 +3040,7 @@
           <w:color w:val="595959"/>
           <w:sz w:val="18"/>
         </w:rPr>
-        <w:t>Figura 10. Vendedores</w:t>
+        <w:t>Figura 11. Vendedores</w:t>
       </w:r>
     </w:p>
     <w:p>
@@ -3221,7 +3221,228 @@
         <w:pStyle w:val="Heading2"/>
       </w:pPr>
       <w:r>
-        <w:t>11. Cartera por Cobrar</w:t>
+        <w:t>12. Importación Masiva de Artículos</w:t>
+      </w:r>
+    </w:p>
+    <w:p>
+      <w:pPr>
+        <w:jc w:val="both"/>
+      </w:pPr>
+      <w:r>
+        <w:t>Herramienta para cargar cientos o miles de productos al catálogo desde un archivo CSV, ideal para empresas que migran desde otro sistema o que reciben catálogos de proveedores en formato electrónico. El sistema crea automáticamente los productos, el saldo inicial en bodega y el registro de kardex.</w:t>
+      </w:r>
+    </w:p>
+    <w:p>
+      <w:pPr>
+        <w:pStyle w:val="Heading3"/>
+      </w:pPr>
+      <w:r>
+        <w:t>Elementos principales de la pantalla</w:t>
+      </w:r>
+    </w:p>
+    <w:p>
+      <w:pPr>
+        <w:pStyle w:val="ListBullet"/>
+      </w:pPr>
+      <w:r>
+        <w:t>Botón 'Seleccionar archivo CSV'</w:t>
+      </w:r>
+    </w:p>
+    <w:p>
+      <w:pPr>
+        <w:pStyle w:val="ListBullet"/>
+      </w:pPr>
+      <w:r>
+        <w:t>Área de arrastre (drag &amp; drop) para soltar el archivo</w:t>
+      </w:r>
+    </w:p>
+    <w:p>
+      <w:pPr>
+        <w:pStyle w:val="ListBullet"/>
+      </w:pPr>
+      <w:r>
+        <w:t>Vista previa de los primeros 20 registros antes de importar</w:t>
+      </w:r>
+    </w:p>
+    <w:p>
+      <w:pPr>
+        <w:pStyle w:val="ListBullet"/>
+      </w:pPr>
+      <w:r>
+        <w:t>Selector de empresa y bodega destino</w:t>
+      </w:r>
+    </w:p>
+    <w:p>
+      <w:pPr>
+        <w:pStyle w:val="ListBullet"/>
+      </w:pPr>
+      <w:r>
+        <w:t>Botón 'Importar' (visible tras seleccionar el archivo)</w:t>
+      </w:r>
+    </w:p>
+    <w:p>
+      <w:pPr>
+        <w:pStyle w:val="ListBullet"/>
+      </w:pPr>
+      <w:r>
+        <w:t>Barra de progreso durante la importación</w:t>
+      </w:r>
+    </w:p>
+    <w:p>
+      <w:pPr>
+        <w:pStyle w:val="ListBullet"/>
+      </w:pPr>
+      <w:r>
+        <w:t>Resumen final: registros importados, omitidos (duplicados), errores</w:t>
+      </w:r>
+    </w:p>
+    <w:p>
+      <w:pPr>
+        <w:pStyle w:val="Heading3"/>
+      </w:pPr>
+      <w:r>
+        <w:t>Cómo usarlo: paso a paso</w:t>
+      </w:r>
+    </w:p>
+    <w:p>
+      <w:pPr>
+        <w:pStyle w:val="ListNumber"/>
+      </w:pPr>
+      <w:r>
+        <w:t>Prepare el archivo CSV con separador punto y coma (;).</w:t>
+      </w:r>
+    </w:p>
+    <w:p>
+      <w:pPr>
+        <w:pStyle w:val="ListNumber"/>
+      </w:pPr>
+      <w:r>
+        <w:t>Columnas requeridas: código, nombre, precio, costo, categoría, stock.</w:t>
+      </w:r>
+    </w:p>
+    <w:p>
+      <w:pPr>
+        <w:pStyle w:val="ListNumber"/>
+      </w:pPr>
+      <w:r>
+        <w:t>Ingrese al módulo Inventario → Importar Artículos.</w:t>
+      </w:r>
+    </w:p>
+    <w:p>
+      <w:pPr>
+        <w:pStyle w:val="ListNumber"/>
+      </w:pPr>
+      <w:r>
+        <w:t>Haga clic en 'Seleccionar archivo CSV' o arrastre el archivo al área indicada.</w:t>
+      </w:r>
+    </w:p>
+    <w:p>
+      <w:pPr>
+        <w:pStyle w:val="ListNumber"/>
+      </w:pPr>
+      <w:r>
+        <w:t>Revise la vista previa de los primeros 20 registros para verificar que el formato es correcto.</w:t>
+      </w:r>
+    </w:p>
+    <w:p>
+      <w:pPr>
+        <w:pStyle w:val="ListNumber"/>
+      </w:pPr>
+      <w:r>
+        <w:t>Seleccione la bodega destino donde se registrará el saldo inicial.</w:t>
+      </w:r>
+    </w:p>
+    <w:p>
+      <w:pPr>
+        <w:pStyle w:val="ListNumber"/>
+      </w:pPr>
+      <w:r>
+        <w:t>Haga clic en 'Importar'.</w:t>
+      </w:r>
+    </w:p>
+    <w:p>
+      <w:pPr>
+        <w:pStyle w:val="ListNumber"/>
+      </w:pPr>
+      <w:r>
+        <w:t>Espere a que el sistema procese los datos (se importan en lotes de 50).</w:t>
+      </w:r>
+    </w:p>
+    <w:p>
+      <w:pPr>
+        <w:pStyle w:val="ListNumber"/>
+      </w:pPr>
+      <w:r>
+        <w:t>Revise el resumen: productos creados, omitidos (código ya existente) y errores.</w:t>
+      </w:r>
+    </w:p>
+    <w:p>
+      <w:pPr>
+        <w:pStyle w:val="Heading3"/>
+      </w:pPr>
+      <w:r>
+        <w:t>Notas y advertencias</w:t>
+      </w:r>
+    </w:p>
+    <w:p>
+      <w:pPr>
+        <w:pStyle w:val="ListBullet"/>
+      </w:pPr>
+      <w:r>
+        <w:t>El separador del CSV debe ser punto y coma (;), no coma.</w:t>
+      </w:r>
+    </w:p>
+    <w:p>
+      <w:pPr>
+        <w:pStyle w:val="ListBullet"/>
+      </w:pPr>
+      <w:r>
+        <w:t>Las categorías se buscan por nombre; deben existir previamente en el catálogo.</w:t>
+      </w:r>
+    </w:p>
+    <w:p>
+      <w:pPr>
+        <w:pStyle w:val="ListBullet"/>
+      </w:pPr>
+      <w:r>
+        <w:t>Los stocks negativos se convierten automáticamente a 0.</w:t>
+      </w:r>
+    </w:p>
+    <w:p>
+      <w:pPr>
+        <w:pStyle w:val="ListBullet"/>
+      </w:pPr>
+      <w:r>
+        <w:t>Los productos con código duplicado se omiten (no se sobreescriben).</w:t>
+      </w:r>
+    </w:p>
+    <w:p>
+      <w:pPr>
+        <w:pStyle w:val="ListBullet"/>
+      </w:pPr>
+      <w:r>
+        <w:t>Se crean entradas de kardex tipo ENTRADA con el stock inicial.</w:t>
+      </w:r>
+    </w:p>
+    <w:p>
+      <w:pPr>
+        <w:pStyle w:val="ListBullet"/>
+      </w:pPr>
+      <w:r>
+        <w:t>Para catálogos de más de 5.000 artículos, el proceso puede tomar varios minutos.</w:t>
+      </w:r>
+    </w:p>
+    <w:p>
+      <w:r>
+        <w:br w:type="page"/>
+      </w:r>
+    </w:p>
+    <w:p>
+      <w:pPr>
+        <w:pStyle w:val="Heading2"/>
+      </w:pPr>
+      <w:r>
+        <w:t>13. Cartera por Cobrar</w:t>
       </w:r>
     </w:p>
     <w:p>
@@ -3281,7 +3502,7 @@
           <w:color w:val="595959"/>
           <w:sz w:val="18"/>
         </w:rPr>
-        <w:t>Figura 11. Cartera por Cobrar</w:t>
+        <w:t>Figura 13. Cartera por Cobrar</w:t>
       </w:r>
     </w:p>
     <w:p>
@@ -3550,7 +3771,7 @@
         <w:pStyle w:val="Heading2"/>
       </w:pPr>
       <w:r>
-        <w:t>12. Estado de Cuenta por Cliente</w:t>
+        <w:t>14. Estado de Cuenta por Cliente</w:t>
       </w:r>
     </w:p>
     <w:p>
@@ -3610,7 +3831,7 @@
           <w:color w:val="595959"/>
           <w:sz w:val="18"/>
         </w:rPr>
-        <w:t>Figura 12. Estado de Cuenta por Cliente</w:t>
+        <w:t>Figura 14. Estado de Cuenta por Cliente</w:t>
       </w:r>
     </w:p>
     <w:p>
@@ -3791,7 +4012,7 @@
         <w:pStyle w:val="Heading2"/>
       </w:pPr>
       <w:r>
-        <w:t>13. Notas de Crédito</w:t>
+        <w:t>15. Notas de Crédito</w:t>
       </w:r>
     </w:p>
     <w:p>
@@ -3851,7 +4072,7 @@
           <w:color w:val="595959"/>
           <w:sz w:val="18"/>
         </w:rPr>
-        <w:t>Figura 13. Notas de Crédito</w:t>
+        <w:t>Figura 15. Notas de Crédito</w:t>
       </w:r>
     </w:p>
     <w:p>
@@ -4040,7 +4261,7 @@
         <w:pStyle w:val="Heading2"/>
       </w:pPr>
       <w:r>
-        <w:t>14. Anulación de Facturas</w:t>
+        <w:t>16. Anulación de Facturas</w:t>
       </w:r>
     </w:p>
     <w:p>
@@ -4100,7 +4321,7 @@
           <w:color w:val="595959"/>
           <w:sz w:val="18"/>
         </w:rPr>
-        <w:t>Figura 14. Anulación de Facturas</w:t>
+        <w:t>Figura 16. Anulación de Facturas</w:t>
       </w:r>
     </w:p>
     <w:p>
@@ -4305,7 +4526,7 @@
         <w:pStyle w:val="Heading2"/>
       </w:pPr>
       <w:r>
-        <w:t>36. Importación Masiva de Artículos</w:t>
+        <w:t>17. Gestión de Cartera y Cobros</w:t>
       </w:r>
     </w:p>
     <w:p>
@@ -4313,7 +4534,7 @@
         <w:jc w:val="both"/>
       </w:pPr>
       <w:r>
-        <w:t>Herramienta para cargar cientos o miles de productos al catálogo desde un archivo CSV, ideal para empresas que migran desde otro sistema o que reciben catálogos de proveedores en formato electrónico. El sistema crea automáticamente los productos, el saldo inicial en bodega y el registro de kardex.</w:t>
+        <w:t>Módulo avanzado de gestión de cobros que consolida toda la cartera pendiente de la empresa con semáforo de antigüedad, KPIs ejecutivos, herramientas de comunicación directa con el cliente (WhatsApp, email, carta) y registro histórico de cada gestión de cobro realizada. Incluye score de riesgo crediticio por cliente y siete reportes especializados de cartera.</w:t>
       </w:r>
     </w:p>
     <w:p>
@@ -4329,55 +4550,95 @@
         <w:pStyle w:val="ListBullet"/>
       </w:pPr>
       <w:r>
-        <w:t>Botón 'Seleccionar archivo CSV'</w:t>
-      </w:r>
-    </w:p>
-    <w:p>
-      <w:pPr>
-        <w:pStyle w:val="ListBullet"/>
-      </w:pPr>
-      <w:r>
-        <w:t>Área de arrastre (drag &amp; drop) para soltar el archivo</w:t>
-      </w:r>
-    </w:p>
-    <w:p>
-      <w:pPr>
-        <w:pStyle w:val="ListBullet"/>
-      </w:pPr>
-      <w:r>
-        <w:t>Vista previa de los primeros 20 registros antes de importar</w:t>
-      </w:r>
-    </w:p>
-    <w:p>
-      <w:pPr>
-        <w:pStyle w:val="ListBullet"/>
-      </w:pPr>
-      <w:r>
-        <w:t>Selector de empresa y bodega destino</w:t>
-      </w:r>
-    </w:p>
-    <w:p>
-      <w:pPr>
-        <w:pStyle w:val="ListBullet"/>
-      </w:pPr>
-      <w:r>
-        <w:t>Botón 'Importar' (visible tras seleccionar el archivo)</w:t>
-      </w:r>
-    </w:p>
-    <w:p>
-      <w:pPr>
-        <w:pStyle w:val="ListBullet"/>
-      </w:pPr>
-      <w:r>
-        <w:t>Barra de progreso durante la importación</w:t>
-      </w:r>
-    </w:p>
-    <w:p>
-      <w:pPr>
-        <w:pStyle w:val="ListBullet"/>
-      </w:pPr>
-      <w:r>
-        <w:t>Resumen final: registros importados, omitidos (duplicados), errores</w:t>
+        <w:t>Panel de 6 KPIs: Total Cartera, Total Vencido, Por Vencer, Clientes en Mora, Promedio Días Mora, Rotación de Cartera (días)</w:t>
+      </w:r>
+    </w:p>
+    <w:p>
+      <w:pPr>
+        <w:pStyle w:val="ListBullet"/>
+      </w:pPr>
+      <w:r>
+        <w:t>Filtros: cliente (buscador), vendedor, estado (todas/vencidas/por vencer), fecha de corte</w:t>
+      </w:r>
+    </w:p>
+    <w:p>
+      <w:pPr>
+        <w:pStyle w:val="ListBullet"/>
+      </w:pPr>
+      <w:r>
+        <w:t>Tabs: Toda la cartera / 0-365 días / Más de 1 año</w:t>
+      </w:r>
+    </w:p>
+    <w:p>
+      <w:pPr>
+        <w:pStyle w:val="ListBullet"/>
+      </w:pPr>
+      <w:r>
+        <w:t>Tabla con semáforo visual por antigüedad de deuda:</w:t>
+      </w:r>
+    </w:p>
+    <w:p>
+      <w:pPr>
+        <w:pStyle w:val="ListBullet"/>
+      </w:pPr>
+      <w:r>
+        <w:t xml:space="preserve">  • Verde: por vencer o &lt; 30 días</w:t>
+      </w:r>
+    </w:p>
+    <w:p>
+      <w:pPr>
+        <w:pStyle w:val="ListBullet"/>
+      </w:pPr>
+      <w:r>
+        <w:t xml:space="preserve">  • Amarillo: 30–90 días vencida</w:t>
+      </w:r>
+    </w:p>
+    <w:p>
+      <w:pPr>
+        <w:pStyle w:val="ListBullet"/>
+      </w:pPr>
+      <w:r>
+        <w:t xml:space="preserve">  • Rojo: 90–180 días vencida</w:t>
+      </w:r>
+    </w:p>
+    <w:p>
+      <w:pPr>
+        <w:pStyle w:val="ListBullet"/>
+      </w:pPr>
+      <w:r>
+        <w:t xml:space="preserve">  • Negro: más de 180 días vencida</w:t>
+      </w:r>
+    </w:p>
+    <w:p>
+      <w:pPr>
+        <w:pStyle w:val="ListBullet"/>
+      </w:pPr>
+      <w:r>
+        <w:t>Score crediticio del cliente: badge verde/amarillo/rojo/negro</w:t>
+      </w:r>
+    </w:p>
+    <w:p>
+      <w:pPr>
+        <w:pStyle w:val="ListBullet"/>
+      </w:pPr>
+      <w:r>
+        <w:t>Acciones por fila: Gestión (📋), WhatsApp (💬), Email (✉️), Llamada (📞)</w:t>
+      </w:r>
+    </w:p>
+    <w:p>
+      <w:pPr>
+        <w:pStyle w:val="ListBullet"/>
+      </w:pPr>
+      <w:r>
+        <w:t>Totales al pie de tabla</w:t>
+      </w:r>
+    </w:p>
+    <w:p>
+      <w:pPr>
+        <w:pStyle w:val="ListBullet"/>
+      </w:pPr>
+      <w:r>
+        <w:t>Dropdown 'Reportes' con 7 reportes exportables a Excel</w:t>
       </w:r>
     </w:p>
     <w:p>
@@ -4393,71 +4654,111 @@
         <w:pStyle w:val="ListNumber"/>
       </w:pPr>
       <w:r>
-        <w:t>Prepare el archivo CSV con separador punto y coma (;).</w:t>
-      </w:r>
-    </w:p>
-    <w:p>
-      <w:pPr>
-        <w:pStyle w:val="ListNumber"/>
-      </w:pPr>
-      <w:r>
-        <w:t>Columnas requeridas: código, nombre, precio, costo, categoría, stock.</w:t>
-      </w:r>
-    </w:p>
-    <w:p>
-      <w:pPr>
-        <w:pStyle w:val="ListNumber"/>
-      </w:pPr>
-      <w:r>
-        <w:t>Ingrese al módulo Inventario → Importar Artículos.</w:t>
-      </w:r>
-    </w:p>
-    <w:p>
-      <w:pPr>
-        <w:pStyle w:val="ListNumber"/>
-      </w:pPr>
-      <w:r>
-        <w:t>Haga clic en 'Seleccionar archivo CSV' o arrastre el archivo al área indicada.</w:t>
-      </w:r>
-    </w:p>
-    <w:p>
-      <w:pPr>
-        <w:pStyle w:val="ListNumber"/>
-      </w:pPr>
-      <w:r>
-        <w:t>Revise la vista previa de los primeros 20 registros para verificar que el formato es correcto.</w:t>
-      </w:r>
-    </w:p>
-    <w:p>
-      <w:pPr>
-        <w:pStyle w:val="ListNumber"/>
-      </w:pPr>
-      <w:r>
-        <w:t>Seleccione la bodega destino donde se registrará el saldo inicial.</w:t>
-      </w:r>
-    </w:p>
-    <w:p>
-      <w:pPr>
-        <w:pStyle w:val="ListNumber"/>
-      </w:pPr>
-      <w:r>
-        <w:t>Haga clic en 'Importar'.</w:t>
-      </w:r>
-    </w:p>
-    <w:p>
-      <w:pPr>
-        <w:pStyle w:val="ListNumber"/>
-      </w:pPr>
-      <w:r>
-        <w:t>Espere a que el sistema procese los datos (se importan en lotes de 50).</w:t>
-      </w:r>
-    </w:p>
-    <w:p>
-      <w:pPr>
-        <w:pStyle w:val="ListNumber"/>
-      </w:pPr>
-      <w:r>
-        <w:t>Revise el resumen: productos creados, omitidos (código ya existente) y errores.</w:t>
+        <w:t>Ingresar a Clientes → Gestión de Cartera.</w:t>
+      </w:r>
+    </w:p>
+    <w:p>
+      <w:pPr>
+        <w:pStyle w:val="ListNumber"/>
+      </w:pPr>
+      <w:r>
+        <w:t>Revisar los 6 KPIs en la parte superior para tener una visión general.</w:t>
+      </w:r>
+    </w:p>
+    <w:p>
+      <w:pPr>
+        <w:pStyle w:val="ListNumber"/>
+      </w:pPr>
+      <w:r>
+        <w:t>Usar los filtros para enfocarse en un cliente, vendedor o rango de antigüedad.</w:t>
+      </w:r>
+    </w:p>
+    <w:p>
+      <w:pPr>
+        <w:pStyle w:val="ListNumber"/>
+      </w:pPr>
+      <w:r>
+        <w:t>Hacer clic en el ícono 📋 de una factura para abrir el panel lateral de gestión:</w:t>
+      </w:r>
+    </w:p>
+    <w:p>
+      <w:pPr>
+        <w:pStyle w:val="ListNumber"/>
+      </w:pPr>
+      <w:r>
+        <w:t xml:space="preserve">  a) Revisar el historial de gestiones anteriores en el tab 'Historial'.</w:t>
+      </w:r>
+    </w:p>
+    <w:p>
+      <w:pPr>
+        <w:pStyle w:val="ListNumber"/>
+      </w:pPr>
+      <w:r>
+        <w:t xml:space="preserve">  b) Ir al tab 'Nueva Gestión' para registrar la acción actual.</w:t>
+      </w:r>
+    </w:p>
+    <w:p>
+      <w:pPr>
+        <w:pStyle w:val="ListNumber"/>
+      </w:pPr>
+      <w:r>
+        <w:t xml:space="preserve">  c) Seleccionar el canal (Llamada/Email/WhatsApp/Visita/Carta).</w:t>
+      </w:r>
+    </w:p>
+    <w:p>
+      <w:pPr>
+        <w:pStyle w:val="ListNumber"/>
+      </w:pPr>
+      <w:r>
+        <w:t xml:space="preserve">  d) Indicar el estado resultante y escribir la observación.</w:t>
+      </w:r>
+    </w:p>
+    <w:p>
+      <w:pPr>
+        <w:pStyle w:val="ListNumber"/>
+      </w:pPr>
+      <w:r>
+        <w:t xml:space="preserve">  e) Si hubo promesa de pago, activar el toggle y registrar fecha y monto.</w:t>
+      </w:r>
+    </w:p>
+    <w:p>
+      <w:pPr>
+        <w:pStyle w:val="ListNumber"/>
+      </w:pPr>
+      <w:r>
+        <w:t xml:space="preserve">  f) Indicar la próxima fecha de seguimiento.</w:t>
+      </w:r>
+    </w:p>
+    <w:p>
+      <w:pPr>
+        <w:pStyle w:val="ListNumber"/>
+      </w:pPr>
+      <w:r>
+        <w:t xml:space="preserve">  g) Hacer clic en 'Guardar Gestión'.</w:t>
+      </w:r>
+    </w:p>
+    <w:p>
+      <w:pPr>
+        <w:pStyle w:val="ListNumber"/>
+      </w:pPr>
+      <w:r>
+        <w:t>Para enviar WhatsApp: hacer clic en 💬; elegir el nivel (1er aviso/2do aviso/Prejudicial); se abre WhatsApp con el mensaje pre-redactado; hacer clic en Enviar.</w:t>
+      </w:r>
+    </w:p>
+    <w:p>
+      <w:pPr>
+        <w:pStyle w:val="ListNumber"/>
+      </w:pPr>
+      <w:r>
+        <w:t>Para generar carta de cobro: hacer clic en 'Carta' dentro del panel; se abre la vista de impresión con el formato formal.</w:t>
+      </w:r>
+    </w:p>
+    <w:p>
+      <w:pPr>
+        <w:pStyle w:val="ListNumber"/>
+      </w:pPr>
+      <w:r>
+        <w:t>Para reportes: hacer clic en el botón 'Reportes' en el header y seleccionar el reporte deseado.</w:t>
       </w:r>
     </w:p>
     <w:p>
@@ -4473,47 +4774,47 @@
         <w:pStyle w:val="ListBullet"/>
       </w:pPr>
       <w:r>
-        <w:t>El separador del CSV debe ser punto y coma (;), no coma.</w:t>
-      </w:r>
-    </w:p>
-    <w:p>
-      <w:pPr>
-        <w:pStyle w:val="ListBullet"/>
-      </w:pPr>
-      <w:r>
-        <w:t>Las categorías se buscan por nombre; deben existir previamente en el catálogo.</w:t>
-      </w:r>
-    </w:p>
-    <w:p>
-      <w:pPr>
-        <w:pStyle w:val="ListBullet"/>
-      </w:pPr>
-      <w:r>
-        <w:t>Los stocks negativos se convierten automáticamente a 0.</w:t>
-      </w:r>
-    </w:p>
-    <w:p>
-      <w:pPr>
-        <w:pStyle w:val="ListBullet"/>
-      </w:pPr>
-      <w:r>
-        <w:t>Los productos con código duplicado se omiten (no se sobreescriben).</w:t>
-      </w:r>
-    </w:p>
-    <w:p>
-      <w:pPr>
-        <w:pStyle w:val="ListBullet"/>
-      </w:pPr>
-      <w:r>
-        <w:t>Se crean entradas de kardex tipo ENTRADA con el stock inicial.</w:t>
-      </w:r>
-    </w:p>
-    <w:p>
-      <w:pPr>
-        <w:pStyle w:val="ListBullet"/>
-      </w:pPr>
-      <w:r>
-        <w:t>Para catálogos de más de 5.000 artículos, el proceso puede tomar varios minutos.</w:t>
+        <w:t>El Score crediticio (0-100) se calcula automáticamente con 4 factores: promedio días retraso, % promesas cumplidas, frecuencia de mora y monto máximo de deuda.</w:t>
+      </w:r>
+    </w:p>
+    <w:p>
+      <w:pPr>
+        <w:pStyle w:val="ListBullet"/>
+      </w:pPr>
+      <w:r>
+        <w:t>Los 7 reportes disponibles son: Aging (antigüedad), Cartera actual, Por Vendedor, Efectividad del Cobrador, Promesas de Pago, Acuerdos en Cuotas, Comparativo 12 meses, Clientes Alto Riesgo.</w:t>
+      </w:r>
+    </w:p>
+    <w:p>
+      <w:pPr>
+        <w:pStyle w:val="ListBullet"/>
+      </w:pPr>
+      <w:r>
+        <w:t>El mensaje de WhatsApp es un enlace wa.me/ que abre el WhatsApp del cobrador en su celular; no tiene costo adicional.</w:t>
+      </w:r>
+    </w:p>
+    <w:p>
+      <w:pPr>
+        <w:pStyle w:val="ListBullet"/>
+      </w:pPr>
+      <w:r>
+        <w:t>Las plantillas de WhatsApp (1er aviso, 2do aviso, Prejudicial) son configurables por la empresa.</w:t>
+      </w:r>
+    </w:p>
+    <w:p>
+      <w:pPr>
+        <w:pStyle w:val="ListBullet"/>
+      </w:pPr>
+      <w:r>
+        <w:t>El índice de Rotación de Cartera indica cuántos días en promedio tarda la empresa en cobrar (menor = mejor).</w:t>
+      </w:r>
+    </w:p>
+    <w:p>
+      <w:pPr>
+        <w:pStyle w:val="ListBullet"/>
+      </w:pPr>
+      <w:r>
+        <w:t>La próxima fecha de seguimiento aparece en la tabla para planificar el trabajo de cobros.</w:t>
       </w:r>
     </w:p>
     <w:p>
@@ -4523,319 +4824,18 @@
     </w:p>
     <w:p>
       <w:pPr>
+        <w:pStyle w:val="Heading1"/>
+      </w:pPr>
+      <w:r>
+        <w:t>Consultas, Compras y Cartera por Pagar</w:t>
+      </w:r>
+    </w:p>
+    <w:p>
+      <w:pPr>
         <w:pStyle w:val="Heading2"/>
       </w:pPr>
       <w:r>
-        <w:t>40. Gestión de Cartera y Cobros</w:t>
-      </w:r>
-    </w:p>
-    <w:p>
-      <w:pPr>
-        <w:jc w:val="both"/>
-      </w:pPr>
-      <w:r>
-        <w:t>Módulo avanzado de gestión de cobros que consolida toda la cartera pendiente de la empresa con semáforo de antigüedad, KPIs ejecutivos, herramientas de comunicación directa con el cliente (WhatsApp, email, carta) y registro histórico de cada gestión de cobro realizada. Incluye score de riesgo crediticio por cliente y siete reportes especializados de cartera.</w:t>
-      </w:r>
-    </w:p>
-    <w:p>
-      <w:pPr>
-        <w:pStyle w:val="Heading3"/>
-      </w:pPr>
-      <w:r>
-        <w:t>Elementos principales de la pantalla</w:t>
-      </w:r>
-    </w:p>
-    <w:p>
-      <w:pPr>
-        <w:pStyle w:val="ListBullet"/>
-      </w:pPr>
-      <w:r>
-        <w:t>Panel de 6 KPIs: Total Cartera, Total Vencido, Por Vencer, Clientes en Mora, Promedio Días Mora, Rotación de Cartera (días)</w:t>
-      </w:r>
-    </w:p>
-    <w:p>
-      <w:pPr>
-        <w:pStyle w:val="ListBullet"/>
-      </w:pPr>
-      <w:r>
-        <w:t>Filtros: cliente (buscador), vendedor, estado (todas/vencidas/por vencer), fecha de corte</w:t>
-      </w:r>
-    </w:p>
-    <w:p>
-      <w:pPr>
-        <w:pStyle w:val="ListBullet"/>
-      </w:pPr>
-      <w:r>
-        <w:t>Tabs: Toda la cartera / 0-365 días / Más de 1 año</w:t>
-      </w:r>
-    </w:p>
-    <w:p>
-      <w:pPr>
-        <w:pStyle w:val="ListBullet"/>
-      </w:pPr>
-      <w:r>
-        <w:t>Tabla con semáforo visual por antigüedad de deuda:</w:t>
-      </w:r>
-    </w:p>
-    <w:p>
-      <w:pPr>
-        <w:pStyle w:val="ListBullet"/>
-      </w:pPr>
-      <w:r>
-        <w:t xml:space="preserve">  • Verde: por vencer o &lt; 30 días</w:t>
-      </w:r>
-    </w:p>
-    <w:p>
-      <w:pPr>
-        <w:pStyle w:val="ListBullet"/>
-      </w:pPr>
-      <w:r>
-        <w:t xml:space="preserve">  • Amarillo: 30–90 días vencida</w:t>
-      </w:r>
-    </w:p>
-    <w:p>
-      <w:pPr>
-        <w:pStyle w:val="ListBullet"/>
-      </w:pPr>
-      <w:r>
-        <w:t xml:space="preserve">  • Rojo: 90–180 días vencida</w:t>
-      </w:r>
-    </w:p>
-    <w:p>
-      <w:pPr>
-        <w:pStyle w:val="ListBullet"/>
-      </w:pPr>
-      <w:r>
-        <w:t xml:space="preserve">  • Negro: más de 180 días vencida</w:t>
-      </w:r>
-    </w:p>
-    <w:p>
-      <w:pPr>
-        <w:pStyle w:val="ListBullet"/>
-      </w:pPr>
-      <w:r>
-        <w:t>Score crediticio del cliente: badge verde/amarillo/rojo/negro</w:t>
-      </w:r>
-    </w:p>
-    <w:p>
-      <w:pPr>
-        <w:pStyle w:val="ListBullet"/>
-      </w:pPr>
-      <w:r>
-        <w:t>Acciones por fila: Gestión (📋), WhatsApp (💬), Email (✉️), Llamada (📞)</w:t>
-      </w:r>
-    </w:p>
-    <w:p>
-      <w:pPr>
-        <w:pStyle w:val="ListBullet"/>
-      </w:pPr>
-      <w:r>
-        <w:t>Totales al pie de tabla</w:t>
-      </w:r>
-    </w:p>
-    <w:p>
-      <w:pPr>
-        <w:pStyle w:val="ListBullet"/>
-      </w:pPr>
-      <w:r>
-        <w:t>Dropdown 'Reportes' con 7 reportes exportables a Excel</w:t>
-      </w:r>
-    </w:p>
-    <w:p>
-      <w:pPr>
-        <w:pStyle w:val="Heading3"/>
-      </w:pPr>
-      <w:r>
-        <w:t>Cómo usarlo: paso a paso</w:t>
-      </w:r>
-    </w:p>
-    <w:p>
-      <w:pPr>
-        <w:pStyle w:val="ListNumber"/>
-      </w:pPr>
-      <w:r>
-        <w:t>Ingresar a Clientes → Gestión de Cartera.</w:t>
-      </w:r>
-    </w:p>
-    <w:p>
-      <w:pPr>
-        <w:pStyle w:val="ListNumber"/>
-      </w:pPr>
-      <w:r>
-        <w:t>Revisar los 6 KPIs en la parte superior para tener una visión general.</w:t>
-      </w:r>
-    </w:p>
-    <w:p>
-      <w:pPr>
-        <w:pStyle w:val="ListNumber"/>
-      </w:pPr>
-      <w:r>
-        <w:t>Usar los filtros para enfocarse en un cliente, vendedor o rango de antigüedad.</w:t>
-      </w:r>
-    </w:p>
-    <w:p>
-      <w:pPr>
-        <w:pStyle w:val="ListNumber"/>
-      </w:pPr>
-      <w:r>
-        <w:t>Hacer clic en el ícono 📋 de una factura para abrir el panel lateral de gestión:</w:t>
-      </w:r>
-    </w:p>
-    <w:p>
-      <w:pPr>
-        <w:pStyle w:val="ListNumber"/>
-      </w:pPr>
-      <w:r>
-        <w:t xml:space="preserve">  a) Revisar el historial de gestiones anteriores en el tab 'Historial'.</w:t>
-      </w:r>
-    </w:p>
-    <w:p>
-      <w:pPr>
-        <w:pStyle w:val="ListNumber"/>
-      </w:pPr>
-      <w:r>
-        <w:t xml:space="preserve">  b) Ir al tab 'Nueva Gestión' para registrar la acción actual.</w:t>
-      </w:r>
-    </w:p>
-    <w:p>
-      <w:pPr>
-        <w:pStyle w:val="ListNumber"/>
-      </w:pPr>
-      <w:r>
-        <w:t xml:space="preserve">  c) Seleccionar el canal (Llamada/Email/WhatsApp/Visita/Carta).</w:t>
-      </w:r>
-    </w:p>
-    <w:p>
-      <w:pPr>
-        <w:pStyle w:val="ListNumber"/>
-      </w:pPr>
-      <w:r>
-        <w:t xml:space="preserve">  d) Indicar el estado resultante y escribir la observación.</w:t>
-      </w:r>
-    </w:p>
-    <w:p>
-      <w:pPr>
-        <w:pStyle w:val="ListNumber"/>
-      </w:pPr>
-      <w:r>
-        <w:t xml:space="preserve">  e) Si hubo promesa de pago, activar el toggle y registrar fecha y monto.</w:t>
-      </w:r>
-    </w:p>
-    <w:p>
-      <w:pPr>
-        <w:pStyle w:val="ListNumber"/>
-      </w:pPr>
-      <w:r>
-        <w:t xml:space="preserve">  f) Indicar la próxima fecha de seguimiento.</w:t>
-      </w:r>
-    </w:p>
-    <w:p>
-      <w:pPr>
-        <w:pStyle w:val="ListNumber"/>
-      </w:pPr>
-      <w:r>
-        <w:t xml:space="preserve">  g) Hacer clic en 'Guardar Gestión'.</w:t>
-      </w:r>
-    </w:p>
-    <w:p>
-      <w:pPr>
-        <w:pStyle w:val="ListNumber"/>
-      </w:pPr>
-      <w:r>
-        <w:t>Para enviar WhatsApp: hacer clic en 💬; elegir el nivel (1er aviso/2do aviso/Prejudicial); se abre WhatsApp con el mensaje pre-redactado; hacer clic en Enviar.</w:t>
-      </w:r>
-    </w:p>
-    <w:p>
-      <w:pPr>
-        <w:pStyle w:val="ListNumber"/>
-      </w:pPr>
-      <w:r>
-        <w:t>Para generar carta de cobro: hacer clic en 'Carta' dentro del panel; se abre la vista de impresión con el formato formal.</w:t>
-      </w:r>
-    </w:p>
-    <w:p>
-      <w:pPr>
-        <w:pStyle w:val="ListNumber"/>
-      </w:pPr>
-      <w:r>
-        <w:t>Para reportes: hacer clic en el botón 'Reportes' en el header y seleccionar el reporte deseado.</w:t>
-      </w:r>
-    </w:p>
-    <w:p>
-      <w:pPr>
-        <w:pStyle w:val="Heading3"/>
-      </w:pPr>
-      <w:r>
-        <w:t>Notas y advertencias</w:t>
-      </w:r>
-    </w:p>
-    <w:p>
-      <w:pPr>
-        <w:pStyle w:val="ListBullet"/>
-      </w:pPr>
-      <w:r>
-        <w:t>El Score crediticio (0-100) se calcula automáticamente con 4 factores: promedio días retraso, % promesas cumplidas, frecuencia de mora y monto máximo de deuda.</w:t>
-      </w:r>
-    </w:p>
-    <w:p>
-      <w:pPr>
-        <w:pStyle w:val="ListBullet"/>
-      </w:pPr>
-      <w:r>
-        <w:t>Los 7 reportes disponibles son: Aging (antigüedad), Cartera actual, Por Vendedor, Efectividad del Cobrador, Promesas de Pago, Acuerdos en Cuotas, Comparativo 12 meses, Clientes Alto Riesgo.</w:t>
-      </w:r>
-    </w:p>
-    <w:p>
-      <w:pPr>
-        <w:pStyle w:val="ListBullet"/>
-      </w:pPr>
-      <w:r>
-        <w:t>El mensaje de WhatsApp es un enlace wa.me/ que abre el WhatsApp del cobrador en su celular; no tiene costo adicional.</w:t>
-      </w:r>
-    </w:p>
-    <w:p>
-      <w:pPr>
-        <w:pStyle w:val="ListBullet"/>
-      </w:pPr>
-      <w:r>
-        <w:t>Las plantillas de WhatsApp (1er aviso, 2do aviso, Prejudicial) son configurables por la empresa.</w:t>
-      </w:r>
-    </w:p>
-    <w:p>
-      <w:pPr>
-        <w:pStyle w:val="ListBullet"/>
-      </w:pPr>
-      <w:r>
-        <w:t>El índice de Rotación de Cartera indica cuántos días en promedio tarda la empresa en cobrar (menor = mejor).</w:t>
-      </w:r>
-    </w:p>
-    <w:p>
-      <w:pPr>
-        <w:pStyle w:val="ListBullet"/>
-      </w:pPr>
-      <w:r>
-        <w:t>La próxima fecha de seguimiento aparece en la tabla para planificar el trabajo de cobros.</w:t>
-      </w:r>
-    </w:p>
-    <w:p>
-      <w:r>
-        <w:br w:type="page"/>
-      </w:r>
-    </w:p>
-    <w:p>
-      <w:pPr>
-        <w:pStyle w:val="Heading1"/>
-      </w:pPr>
-      <w:r>
-        <w:t>Consultas, Compras y Cartera por Pagar</w:t>
-      </w:r>
-    </w:p>
-    <w:p>
-      <w:pPr>
-        <w:pStyle w:val="Heading2"/>
-      </w:pPr>
-      <w:r>
-        <w:t>15. Historial de Cierres de Caja</w:t>
+        <w:t>18. Historial de Cierres de Caja</w:t>
       </w:r>
     </w:p>
     <w:p>
@@ -4895,7 +4895,7 @@
           <w:color w:val="595959"/>
           <w:sz w:val="18"/>
         </w:rPr>
-        <w:t>Figura 15. Historial de Cierres de Caja</w:t>
+        <w:t>Figura 18. Historial de Cierres de Caja</w:t>
       </w:r>
     </w:p>
     <w:p>
@@ -5028,7 +5028,7 @@
         <w:pStyle w:val="Heading2"/>
       </w:pPr>
       <w:r>
-        <w:t>16. Ventas por Período</w:t>
+        <w:t>19. Ventas por Período</w:t>
       </w:r>
     </w:p>
     <w:p>
@@ -5088,7 +5088,7 @@
           <w:color w:val="595959"/>
           <w:sz w:val="18"/>
         </w:rPr>
-        <w:t>Figura 16. Ventas por Período</w:t>
+        <w:t>Figura 19. Ventas por Período</w:t>
       </w:r>
     </w:p>
     <w:p>
@@ -5237,7 +5237,228 @@
         <w:pStyle w:val="Heading2"/>
       </w:pPr>
       <w:r>
-        <w:t>17. Cuentas por Pagar</w:t>
+        <w:t>20. Ventas por Cliente</w:t>
+      </w:r>
+    </w:p>
+    <w:p>
+      <w:pPr>
+        <w:jc w:val="both"/>
+      </w:pPr>
+      <w:r>
+        <w:t>Reporte ejecutivo de todas las facturas de un cliente específico en un período, mostrando el estado de pago de cada una (si está cancelada, en crédito o parcialmente pagada). Permite ver el detalle de productos vendidos al hacer clic sobre cualquier factura, y exportar tanto el resumen como el detalle de productos a Excel.</w:t>
+      </w:r>
+    </w:p>
+    <w:p>
+      <w:pPr>
+        <w:pStyle w:val="Heading3"/>
+      </w:pPr>
+      <w:r>
+        <w:t>Elementos principales de la pantalla</w:t>
+      </w:r>
+    </w:p>
+    <w:p>
+      <w:pPr>
+        <w:pStyle w:val="ListBullet"/>
+      </w:pPr>
+      <w:r>
+        <w:t>Buscador de cliente: campo con autocompletado por nombre o RUC/cédula</w:t>
+      </w:r>
+    </w:p>
+    <w:p>
+      <w:pPr>
+        <w:pStyle w:val="ListBullet"/>
+      </w:pPr>
+      <w:r>
+        <w:t>Selector de período con accesos rápidos: Hoy, Esta semana, Este mes, Mes anterior, Este año</w:t>
+      </w:r>
+    </w:p>
+    <w:p>
+      <w:pPr>
+        <w:pStyle w:val="ListBullet"/>
+      </w:pPr>
+      <w:r>
+        <w:t>Selectores de fecha Desde/Hasta para períodos personalizados</w:t>
+      </w:r>
+    </w:p>
+    <w:p>
+      <w:pPr>
+        <w:pStyle w:val="ListBullet"/>
+      </w:pPr>
+      <w:r>
+        <w:t>Botón 'Consultar'</w:t>
+      </w:r>
+    </w:p>
+    <w:p>
+      <w:pPr>
+        <w:pStyle w:val="ListBullet"/>
+      </w:pPr>
+      <w:r>
+        <w:t>Tabla de facturas: No. Factura, Fecha, Total, Pagado, Saldo, Estado, Estado SRI</w:t>
+      </w:r>
+    </w:p>
+    <w:p>
+      <w:pPr>
+        <w:pStyle w:val="ListBullet"/>
+      </w:pPr>
+      <w:r>
+        <w:t>Clic en fila: expande el detalle con formas de pago y líneas de productos</w:t>
+      </w:r>
+    </w:p>
+    <w:p>
+      <w:pPr>
+        <w:pStyle w:val="ListBullet"/>
+      </w:pPr>
+      <w:r>
+        <w:t>Fila de totales al pie: Total, Pagado, Saldo</w:t>
+      </w:r>
+    </w:p>
+    <w:p>
+      <w:pPr>
+        <w:pStyle w:val="ListBullet"/>
+      </w:pPr>
+      <w:r>
+        <w:t>Botón 'Excel': exporta a dos hojas (Resumen + Detalle de Productos)</w:t>
+      </w:r>
+    </w:p>
+    <w:p>
+      <w:pPr>
+        <w:pStyle w:val="ListBullet"/>
+      </w:pPr>
+      <w:r>
+        <w:t>Botón 'Imprimir': reporte formal con nombre de empresa, cliente y período</w:t>
+      </w:r>
+    </w:p>
+    <w:p>
+      <w:pPr>
+        <w:pStyle w:val="Heading3"/>
+      </w:pPr>
+      <w:r>
+        <w:t>Cómo usarlo: paso a paso</w:t>
+      </w:r>
+    </w:p>
+    <w:p>
+      <w:pPr>
+        <w:pStyle w:val="ListNumber"/>
+      </w:pPr>
+      <w:r>
+        <w:t>Escribir el nombre o RUC del cliente en el buscador; seleccionarlo de la lista.</w:t>
+      </w:r>
+    </w:p>
+    <w:p>
+      <w:pPr>
+        <w:pStyle w:val="ListNumber"/>
+      </w:pPr>
+      <w:r>
+        <w:t>Usar un acceso rápido de período o ingresar las fechas manualmente.</w:t>
+      </w:r>
+    </w:p>
+    <w:p>
+      <w:pPr>
+        <w:pStyle w:val="ListNumber"/>
+      </w:pPr>
+      <w:r>
+        <w:t>Hacer clic en 'Consultar'.</w:t>
+      </w:r>
+    </w:p>
+    <w:p>
+      <w:pPr>
+        <w:pStyle w:val="ListNumber"/>
+      </w:pPr>
+      <w:r>
+        <w:t>Revisar la tabla: cada fila es una factura con su estado.</w:t>
+      </w:r>
+    </w:p>
+    <w:p>
+      <w:pPr>
+        <w:pStyle w:val="ListNumber"/>
+      </w:pPr>
+      <w:r>
+        <w:t>Hacer clic en cualquier fila para expandir y ver los productos vendidos y las formas de pago.</w:t>
+      </w:r>
+    </w:p>
+    <w:p>
+      <w:pPr>
+        <w:pStyle w:val="ListNumber"/>
+      </w:pPr>
+      <w:r>
+        <w:t>Hacer clic en 'Excel' para exportar (hoja 'Ventas por Cliente' + hoja 'Detalle Productos').</w:t>
+      </w:r>
+    </w:p>
+    <w:p>
+      <w:pPr>
+        <w:pStyle w:val="ListNumber"/>
+      </w:pPr>
+      <w:r>
+        <w:t>Hacer clic en 'Imprimir' para el reporte formal imprimible.</w:t>
+      </w:r>
+    </w:p>
+    <w:p>
+      <w:pPr>
+        <w:pStyle w:val="Heading3"/>
+      </w:pPr>
+      <w:r>
+        <w:t>Notas y advertencias</w:t>
+      </w:r>
+    </w:p>
+    <w:p>
+      <w:pPr>
+        <w:pStyle w:val="ListBullet"/>
+      </w:pPr>
+      <w:r>
+        <w:t>Estado CANCELADA (verde): factura totalmente pagada.</w:t>
+      </w:r>
+    </w:p>
+    <w:p>
+      <w:pPr>
+        <w:pStyle w:val="ListBullet"/>
+      </w:pPr>
+      <w:r>
+        <w:t>Estado CRÉDITO (amarillo): factura en crédito, sin pagos parciales.</w:t>
+      </w:r>
+    </w:p>
+    <w:p>
+      <w:pPr>
+        <w:pStyle w:val="ListBullet"/>
+      </w:pPr>
+      <w:r>
+        <w:t>Estado PARCIAL (naranja): factura con pagos parciales pero saldo pendiente.</w:t>
+      </w:r>
+    </w:p>
+    <w:p>
+      <w:pPr>
+        <w:pStyle w:val="ListBullet"/>
+      </w:pPr>
+      <w:r>
+        <w:t>Estado ANULADA (rojo): factura anulada, no cuenta en los totales.</w:t>
+      </w:r>
+    </w:p>
+    <w:p>
+      <w:pPr>
+        <w:pStyle w:val="ListBullet"/>
+      </w:pPr>
+      <w:r>
+        <w:t>El saldo en color ámbar indica que hay deuda pendiente.</w:t>
+      </w:r>
+    </w:p>
+    <w:p>
+      <w:pPr>
+        <w:pStyle w:val="ListBullet"/>
+      </w:pPr>
+      <w:r>
+        <w:t>El Excel incluye dos hojas: resumen de facturas y detalle de productos por línea.</w:t>
+      </w:r>
+    </w:p>
+    <w:p>
+      <w:r>
+        <w:br w:type="page"/>
+      </w:r>
+    </w:p>
+    <w:p>
+      <w:pPr>
+        <w:pStyle w:val="Heading2"/>
+      </w:pPr>
+      <w:r>
+        <w:t>21. Cuentas por Pagar</w:t>
       </w:r>
     </w:p>
     <w:p>
@@ -5297,7 +5518,7 @@
           <w:color w:val="595959"/>
           <w:sz w:val="18"/>
         </w:rPr>
-        <w:t>Figura 17. Cuentas por Pagar</w:t>
+        <w:t>Figura 21. Cuentas por Pagar</w:t>
       </w:r>
     </w:p>
     <w:p>
@@ -5446,7 +5667,7 @@
         <w:pStyle w:val="Heading2"/>
       </w:pPr>
       <w:r>
-        <w:t>18. Compras (Inventario y Servicios)</w:t>
+        <w:t>22. Compras (Inventario y Servicios)</w:t>
       </w:r>
     </w:p>
     <w:p>
@@ -5506,7 +5727,7 @@
           <w:color w:val="595959"/>
           <w:sz w:val="18"/>
         </w:rPr>
-        <w:t>Figura 18. Compras (Inventario y Servicios)</w:t>
+        <w:t>Figura 22. Compras (Inventario y Servicios)</w:t>
       </w:r>
     </w:p>
     <w:p>
@@ -5679,7 +5900,7 @@
         <w:pStyle w:val="Heading2"/>
       </w:pPr>
       <w:r>
-        <w:t>19. Nueva Compra de Inventario</w:t>
+        <w:t>23. Nueva Compra de Inventario</w:t>
       </w:r>
     </w:p>
     <w:p>
@@ -5739,7 +5960,7 @@
           <w:color w:val="595959"/>
           <w:sz w:val="18"/>
         </w:rPr>
-        <w:t>Figura 19. Nueva Compra de Inventario</w:t>
+        <w:t>Figura 23. Nueva Compra de Inventario</w:t>
       </w:r>
     </w:p>
     <w:p>
@@ -5976,7 +6197,7 @@
         <w:pStyle w:val="Heading2"/>
       </w:pPr>
       <w:r>
-        <w:t>20. Estado de Cuenta por Proveedor</w:t>
+        <w:t>24. Estado de Cuenta por Proveedor</w:t>
       </w:r>
     </w:p>
     <w:p>
@@ -6036,7 +6257,7 @@
           <w:color w:val="595959"/>
           <w:sz w:val="18"/>
         </w:rPr>
-        <w:t>Figura 20. Estado de Cuenta por Proveedor</w:t>
+        <w:t>Figura 24. Estado de Cuenta por Proveedor</w:t>
       </w:r>
     </w:p>
     <w:p>
@@ -6238,239 +6459,18 @@
     </w:p>
     <w:p>
       <w:pPr>
+        <w:pStyle w:val="Heading1"/>
+      </w:pPr>
+      <w:r>
+        <w:t>Tesorería</w:t>
+      </w:r>
+    </w:p>
+    <w:p>
+      <w:pPr>
         <w:pStyle w:val="Heading2"/>
       </w:pPr>
       <w:r>
-        <w:t>39. Ventas por Cliente</w:t>
-      </w:r>
-    </w:p>
-    <w:p>
-      <w:pPr>
-        <w:jc w:val="both"/>
-      </w:pPr>
-      <w:r>
-        <w:t>Reporte ejecutivo de todas las facturas de un cliente específico en un período, mostrando el estado de pago de cada una (si está cancelada, en crédito o parcialmente pagada). Permite ver el detalle de productos vendidos al hacer clic sobre cualquier factura, y exportar tanto el resumen como el detalle de productos a Excel.</w:t>
-      </w:r>
-    </w:p>
-    <w:p>
-      <w:pPr>
-        <w:pStyle w:val="Heading3"/>
-      </w:pPr>
-      <w:r>
-        <w:t>Elementos principales de la pantalla</w:t>
-      </w:r>
-    </w:p>
-    <w:p>
-      <w:pPr>
-        <w:pStyle w:val="ListBullet"/>
-      </w:pPr>
-      <w:r>
-        <w:t>Buscador de cliente: campo con autocompletado por nombre o RUC/cédula</w:t>
-      </w:r>
-    </w:p>
-    <w:p>
-      <w:pPr>
-        <w:pStyle w:val="ListBullet"/>
-      </w:pPr>
-      <w:r>
-        <w:t>Selector de período con accesos rápidos: Hoy, Esta semana, Este mes, Mes anterior, Este año</w:t>
-      </w:r>
-    </w:p>
-    <w:p>
-      <w:pPr>
-        <w:pStyle w:val="ListBullet"/>
-      </w:pPr>
-      <w:r>
-        <w:t>Selectores de fecha Desde/Hasta para períodos personalizados</w:t>
-      </w:r>
-    </w:p>
-    <w:p>
-      <w:pPr>
-        <w:pStyle w:val="ListBullet"/>
-      </w:pPr>
-      <w:r>
-        <w:t>Botón 'Consultar'</w:t>
-      </w:r>
-    </w:p>
-    <w:p>
-      <w:pPr>
-        <w:pStyle w:val="ListBullet"/>
-      </w:pPr>
-      <w:r>
-        <w:t>Tabla de facturas: No. Factura, Fecha, Total, Pagado, Saldo, Estado, Estado SRI</w:t>
-      </w:r>
-    </w:p>
-    <w:p>
-      <w:pPr>
-        <w:pStyle w:val="ListBullet"/>
-      </w:pPr>
-      <w:r>
-        <w:t>Clic en fila: expande el detalle con formas de pago y líneas de productos</w:t>
-      </w:r>
-    </w:p>
-    <w:p>
-      <w:pPr>
-        <w:pStyle w:val="ListBullet"/>
-      </w:pPr>
-      <w:r>
-        <w:t>Fila de totales al pie: Total, Pagado, Saldo</w:t>
-      </w:r>
-    </w:p>
-    <w:p>
-      <w:pPr>
-        <w:pStyle w:val="ListBullet"/>
-      </w:pPr>
-      <w:r>
-        <w:t>Botón 'Excel': exporta a dos hojas (Resumen + Detalle de Productos)</w:t>
-      </w:r>
-    </w:p>
-    <w:p>
-      <w:pPr>
-        <w:pStyle w:val="ListBullet"/>
-      </w:pPr>
-      <w:r>
-        <w:t>Botón 'Imprimir': reporte formal con nombre de empresa, cliente y período</w:t>
-      </w:r>
-    </w:p>
-    <w:p>
-      <w:pPr>
-        <w:pStyle w:val="Heading3"/>
-      </w:pPr>
-      <w:r>
-        <w:t>Cómo usarlo: paso a paso</w:t>
-      </w:r>
-    </w:p>
-    <w:p>
-      <w:pPr>
-        <w:pStyle w:val="ListNumber"/>
-      </w:pPr>
-      <w:r>
-        <w:t>Escribir el nombre o RUC del cliente en el buscador; seleccionarlo de la lista.</w:t>
-      </w:r>
-    </w:p>
-    <w:p>
-      <w:pPr>
-        <w:pStyle w:val="ListNumber"/>
-      </w:pPr>
-      <w:r>
-        <w:t>Usar un acceso rápido de período o ingresar las fechas manualmente.</w:t>
-      </w:r>
-    </w:p>
-    <w:p>
-      <w:pPr>
-        <w:pStyle w:val="ListNumber"/>
-      </w:pPr>
-      <w:r>
-        <w:t>Hacer clic en 'Consultar'.</w:t>
-      </w:r>
-    </w:p>
-    <w:p>
-      <w:pPr>
-        <w:pStyle w:val="ListNumber"/>
-      </w:pPr>
-      <w:r>
-        <w:t>Revisar la tabla: cada fila es una factura con su estado.</w:t>
-      </w:r>
-    </w:p>
-    <w:p>
-      <w:pPr>
-        <w:pStyle w:val="ListNumber"/>
-      </w:pPr>
-      <w:r>
-        <w:t>Hacer clic en cualquier fila para expandir y ver los productos vendidos y las formas de pago.</w:t>
-      </w:r>
-    </w:p>
-    <w:p>
-      <w:pPr>
-        <w:pStyle w:val="ListNumber"/>
-      </w:pPr>
-      <w:r>
-        <w:t>Hacer clic en 'Excel' para exportar (hoja 'Ventas por Cliente' + hoja 'Detalle Productos').</w:t>
-      </w:r>
-    </w:p>
-    <w:p>
-      <w:pPr>
-        <w:pStyle w:val="ListNumber"/>
-      </w:pPr>
-      <w:r>
-        <w:t>Hacer clic en 'Imprimir' para el reporte formal imprimible.</w:t>
-      </w:r>
-    </w:p>
-    <w:p>
-      <w:pPr>
-        <w:pStyle w:val="Heading3"/>
-      </w:pPr>
-      <w:r>
-        <w:t>Notas y advertencias</w:t>
-      </w:r>
-    </w:p>
-    <w:p>
-      <w:pPr>
-        <w:pStyle w:val="ListBullet"/>
-      </w:pPr>
-      <w:r>
-        <w:t>Estado CANCELADA (verde): factura totalmente pagada.</w:t>
-      </w:r>
-    </w:p>
-    <w:p>
-      <w:pPr>
-        <w:pStyle w:val="ListBullet"/>
-      </w:pPr>
-      <w:r>
-        <w:t>Estado CRÉDITO (amarillo): factura en crédito, sin pagos parciales.</w:t>
-      </w:r>
-    </w:p>
-    <w:p>
-      <w:pPr>
-        <w:pStyle w:val="ListBullet"/>
-      </w:pPr>
-      <w:r>
-        <w:t>Estado PARCIAL (naranja): factura con pagos parciales pero saldo pendiente.</w:t>
-      </w:r>
-    </w:p>
-    <w:p>
-      <w:pPr>
-        <w:pStyle w:val="ListBullet"/>
-      </w:pPr>
-      <w:r>
-        <w:t>Estado ANULADA (rojo): factura anulada, no cuenta en los totales.</w:t>
-      </w:r>
-    </w:p>
-    <w:p>
-      <w:pPr>
-        <w:pStyle w:val="ListBullet"/>
-      </w:pPr>
-      <w:r>
-        <w:t>El saldo en color ámbar indica que hay deuda pendiente.</w:t>
-      </w:r>
-    </w:p>
-    <w:p>
-      <w:pPr>
-        <w:pStyle w:val="ListBullet"/>
-      </w:pPr>
-      <w:r>
-        <w:t>El Excel incluye dos hojas: resumen de facturas y detalle de productos por línea.</w:t>
-      </w:r>
-    </w:p>
-    <w:p>
-      <w:r>
-        <w:br w:type="page"/>
-      </w:r>
-    </w:p>
-    <w:p>
-      <w:pPr>
-        <w:pStyle w:val="Heading1"/>
-      </w:pPr>
-      <w:r>
-        <w:t>Tesorería</w:t>
-      </w:r>
-    </w:p>
-    <w:p>
-      <w:pPr>
-        <w:pStyle w:val="Heading2"/>
-      </w:pPr>
-      <w:r>
-        <w:t>21. Gestión de Cuentas Bancarias</w:t>
+        <w:t>25. Gestión de Cuentas Bancarias</w:t>
       </w:r>
     </w:p>
     <w:p>
@@ -6530,7 +6530,7 @@
           <w:color w:val="595959"/>
           <w:sz w:val="18"/>
         </w:rPr>
-        <w:t>Figura 21. Gestión de Cuentas Bancarias</w:t>
+        <w:t>Figura 25. Gestión de Cuentas Bancarias</w:t>
       </w:r>
     </w:p>
     <w:p>
@@ -6719,7 +6719,7 @@
         <w:pStyle w:val="Heading2"/>
       </w:pPr>
       <w:r>
-        <w:t>22. Listado de Comprobantes de Egreso</w:t>
+        <w:t>26. Listado de Comprobantes de Egreso</w:t>
       </w:r>
     </w:p>
     <w:p>
@@ -6779,7 +6779,7 @@
           <w:color w:val="595959"/>
           <w:sz w:val="18"/>
         </w:rPr>
-        <w:t>Figura 22. Listado de Comprobantes de Egreso</w:t>
+        <w:t>Figura 26. Listado de Comprobantes de Egreso</w:t>
       </w:r>
     </w:p>
     <w:p>
@@ -6968,7 +6968,7 @@
         <w:pStyle w:val="Heading2"/>
       </w:pPr>
       <w:r>
-        <w:t>23. Crear Nuevo Comprobante de Egreso</w:t>
+        <w:t>27. Crear Nuevo Comprobante de Egreso</w:t>
       </w:r>
     </w:p>
     <w:p>
@@ -7028,7 +7028,7 @@
           <w:color w:val="595959"/>
           <w:sz w:val="18"/>
         </w:rPr>
-        <w:t>Figura 23. Crear Nuevo Comprobante de Egreso</w:t>
+        <w:t>Figura 27. Crear Nuevo Comprobante de Egreso</w:t>
       </w:r>
     </w:p>
     <w:p>
@@ -7265,7 +7265,7 @@
         <w:pStyle w:val="Heading2"/>
       </w:pPr>
       <w:r>
-        <w:t>24. Gestión de Cheques Emitidos</w:t>
+        <w:t>28. Gestión de Cheques Emitidos</w:t>
       </w:r>
     </w:p>
     <w:p>
@@ -7325,7 +7325,7 @@
           <w:color w:val="595959"/>
           <w:sz w:val="18"/>
         </w:rPr>
-        <w:t>Figura 24. Gestión de Cheques Emitidos</w:t>
+        <w:t>Figura 28. Gestión de Cheques Emitidos</w:t>
       </w:r>
     </w:p>
     <w:p>
@@ -7514,7 +7514,7 @@
         <w:pStyle w:val="Heading2"/>
       </w:pPr>
       <w:r>
-        <w:t>25. Conciliación Bancaria</w:t>
+        <w:t>29. Conciliación Bancaria</w:t>
       </w:r>
     </w:p>
     <w:p>
@@ -7574,7 +7574,7 @@
           <w:color w:val="595959"/>
           <w:sz w:val="18"/>
         </w:rPr>
-        <w:t>Figura 25. Conciliación Bancaria</w:t>
+        <w:t>Figura 29. Conciliación Bancaria</w:t>
       </w:r>
     </w:p>
     <w:p>
@@ -7747,7 +7747,7 @@
         <w:pStyle w:val="Heading2"/>
       </w:pPr>
       <w:r>
-        <w:t>38. Cierre de Caja General</w:t>
+        <w:t>30. Cierre de Caja General</w:t>
       </w:r>
     </w:p>
     <w:p>
@@ -8032,7 +8032,7 @@
         <w:pStyle w:val="Heading2"/>
       </w:pPr>
       <w:r>
-        <w:t>26. Dashboard Contable</w:t>
+        <w:t>31. Dashboard Contable</w:t>
       </w:r>
     </w:p>
     <w:p>
@@ -8092,7 +8092,7 @@
           <w:color w:val="595959"/>
           <w:sz w:val="18"/>
         </w:rPr>
-        <w:t>Figura 26. Dashboard Contable</w:t>
+        <w:t>Figura 31. Dashboard Contable</w:t>
       </w:r>
     </w:p>
     <w:p>
@@ -8217,7 +8217,7 @@
         <w:pStyle w:val="Heading2"/>
       </w:pPr>
       <w:r>
-        <w:t>27. Plan de Cuentas</w:t>
+        <w:t>32. Plan de Cuentas</w:t>
       </w:r>
     </w:p>
     <w:p>
@@ -8277,7 +8277,7 @@
           <w:color w:val="595959"/>
           <w:sz w:val="18"/>
         </w:rPr>
-        <w:t>Figura 27. Plan de Cuentas</w:t>
+        <w:t>Figura 32. Plan de Cuentas</w:t>
       </w:r>
     </w:p>
     <w:p>
@@ -8498,7 +8498,7 @@
         <w:pStyle w:val="Heading2"/>
       </w:pPr>
       <w:r>
-        <w:t>28. Diarios Contables (Comprobantes)</w:t>
+        <w:t>33. Diarios Contables (Comprobantes)</w:t>
       </w:r>
     </w:p>
     <w:p>
@@ -8558,7 +8558,7 @@
           <w:color w:val="595959"/>
           <w:sz w:val="18"/>
         </w:rPr>
-        <w:t>Figura 28. Diarios Contables (Comprobantes)</w:t>
+        <w:t>Figura 33. Diarios Contables (Comprobantes)</w:t>
       </w:r>
     </w:p>
     <w:p>
@@ -8755,7 +8755,7 @@
         <w:pStyle w:val="Heading2"/>
       </w:pPr>
       <w:r>
-        <w:t>29. Balance de Comprobación</w:t>
+        <w:t>34. Balance de Comprobación</w:t>
       </w:r>
     </w:p>
     <w:p>
@@ -8815,7 +8815,7 @@
           <w:color w:val="595959"/>
           <w:sz w:val="18"/>
         </w:rPr>
-        <w:t>Figura 29. Balance de Comprobación</w:t>
+        <w:t>Figura 34. Balance de Comprobación</w:t>
       </w:r>
     </w:p>
     <w:p>
@@ -8980,7 +8980,7 @@
         <w:pStyle w:val="Heading2"/>
       </w:pPr>
       <w:r>
-        <w:t>30. Estado de Situación Financiera (Balance General)</w:t>
+        <w:t>35. Estado de Situación Financiera (Balance General)</w:t>
       </w:r>
     </w:p>
     <w:p>
@@ -9040,7 +9040,7 @@
           <w:color w:val="595959"/>
           <w:sz w:val="18"/>
         </w:rPr>
-        <w:t>Figura 30. Estado de Situación Financiera (Balance General)</w:t>
+        <w:t>Figura 35. Estado de Situación Financiera (Balance General)</w:t>
       </w:r>
     </w:p>
     <w:p>
@@ -9205,7 +9205,7 @@
         <w:pStyle w:val="Heading2"/>
       </w:pPr>
       <w:r>
-        <w:t>31. Estado de Resultados</w:t>
+        <w:t>36. Estado de Resultados</w:t>
       </w:r>
     </w:p>
     <w:p>
@@ -9265,7 +9265,7 @@
           <w:color w:val="595959"/>
           <w:sz w:val="18"/>
         </w:rPr>
-        <w:t>Figura 31. Estado de Resultados</w:t>
+        <w:t>Figura 36. Estado de Resultados</w:t>
       </w:r>
     </w:p>
     <w:p>
@@ -9438,7 +9438,7 @@
         <w:pStyle w:val="Heading2"/>
       </w:pPr>
       <w:r>
-        <w:t>32. Comprobantes de Retención</w:t>
+        <w:t>37. Comprobantes de Retención</w:t>
       </w:r>
     </w:p>
     <w:p>
@@ -9498,7 +9498,7 @@
           <w:color w:val="595959"/>
           <w:sz w:val="18"/>
         </w:rPr>
-        <w:t>Figura 32. Comprobantes de Retención</w:t>
+        <w:t>Figura 37. Comprobantes de Retención</w:t>
       </w:r>
     </w:p>
     <w:p>
@@ -9711,7 +9711,7 @@
         <w:pStyle w:val="Heading2"/>
       </w:pPr>
       <w:r>
-        <w:t>33. Ajustes de Contabilidad</w:t>
+        <w:t>38. Ajustes de Contabilidad</w:t>
       </w:r>
     </w:p>
     <w:p>
@@ -9771,7 +9771,7 @@
           <w:color w:val="595959"/>
           <w:sz w:val="18"/>
         </w:rPr>
-        <w:t>Figura 33. Ajustes de Contabilidad</w:t>
+        <w:t>Figura 38. Ajustes de Contabilidad</w:t>
       </w:r>
     </w:p>
     <w:p>
@@ -9928,7 +9928,7 @@
         <w:pStyle w:val="Heading2"/>
       </w:pPr>
       <w:r>
-        <w:t>34. Configuración General del Sistema</w:t>
+        <w:t>39. Configuración General del Sistema</w:t>
       </w:r>
     </w:p>
     <w:p>
@@ -9988,7 +9988,7 @@
           <w:color w:val="595959"/>
           <w:sz w:val="18"/>
         </w:rPr>
-        <w:t>Figura 34. Configuración General del Sistema</w:t>
+        <w:t>Figura 39. Configuración General del Sistema</w:t>
       </w:r>
     </w:p>
     <w:p>
@@ -10369,7 +10369,7 @@
         <w:pStyle w:val="Heading2"/>
       </w:pPr>
       <w:r>
-        <w:t>37. Permisos de Usuario</w:t>
+        <w:t>40. Permisos de Usuario</w:t>
       </w:r>
     </w:p>
     <w:p>

</xml_diff>